<commit_message>
Purpose and Use Memo: edit Section 9 kitemark sentence
</commit_message>
<xml_diff>
--- a/docs/outputs/01_Design/gsr_purpose_and_pilot_summary/20261009_Purpose-and-Use-Memo_final-draft.docx
+++ b/docs/outputs/01_Design/gsr_purpose_and_pilot_summary/20261009_Purpose-and-Use-Memo_final-draft.docx
@@ -3857,10 +3857,17 @@
       <w:r>
         <w:rPr>
           <w:rFonts w:ascii="Source Serif 4" w:cs="Source Serif 4" w:eastAsia="Source Serif 4" w:hAnsi="Source Serif 4"/>
-          <w:color w:val="000000"/>
-          <w:rtl w:val="0"/>
-        </w:rPr>
-        <w:t xml:space="preserve">GSR's board has asked for a light-touch "kitemark," and GSR's trustees report that blockchain project applications are full of jargon and easy to present favourably. A possible follow-on project, the Blockchain Funding Kitemark, would answer one question: how can a trustee, international NGO or mainstream funder with no technical background judge whether a blockchain-based aid project is credible? It would produce a plain-language assessment framework covering governance design, key management (who controls the digital keys that move funds), regulatory compliance, dependence on "off-ramps" (services that convert digital currency into local cash), and whether a shared ledger is needed at all. It would also set a minimum bar for evidence. GSR's observation is that existing pilots report speed and cost, but almost none report social outcomes against what would have happened without the project. GSR would apply the framework to its own portfolio first, then offer it to UNICEF and Mercy Corps Ventures to co-sign. To stay light-touch, the framework would use plain-language questions a non-technical trustee can answer, take the form of a short checklist, and not require a technical audit. The Evidence Map would add value here without changing its primary purpose. Its categories, evidence grades and reporting guidance would be direct inputs, and its findings would test GSR's observation about current evidence so that the evidence bar is set at a realistic level. Whether the Evidence Map also records the Kitemark's assessment areas for each use case is still to be decided.</w:t>
+          <w:rtl w:val="0"/>
+        </w:rPr>
+        <w:t xml:space="preserve">GSR is interested in an effective kitemark, because blockchain project applications are difficult to understand.</w:t>
+      </w:r>
+      <w:r>
+        <w:rPr>
+          <w:rFonts w:ascii="Source Serif 4" w:cs="Source Serif 4" w:eastAsia="Source Serif 4" w:hAnsi="Source Serif 4"/>
+          <w:color w:val="000000"/>
+          <w:rtl w:val="0"/>
+        </w:rPr>
+        <w:t xml:space="preserve"> A possible follow-on project, the Blockchain Funding Kitemark, would answer one question: how can a trustee, international NGO or mainstream funder with no technical background judge whether a blockchain-based aid project is credible? It would produce a plain-language assessment framework covering governance design, key management (who controls the digital keys that move funds), regulatory compliance, dependence on "off-ramps" (services that convert digital currency into local cash), and whether a shared ledger is needed at all. It would also set a minimum bar for evidence. GSR's observation is that existing pilots report speed and cost, but almost none report social outcomes against what would have happened without the project. GSR would apply the framework to its own portfolio first, then offer it to UNICEF and Mercy Corps Ventures to co-sign. To stay light-touch, the framework would use plain-language questions a non-technical trustee can answer, take the form of a short checklist, and not require a technical audit. The Evidence Map would add value here without changing its primary purpose. Its categories, evidence grades and reporting guidance would be direct inputs, and its findings would test GSR's observation about current evidence so that the evidence bar is set at a realistic level. Whether the Evidence Map also records the Kitemark's assessment areas for each use case is still to be decided.</w:t>
       </w:r>
       <w:r>
         <w:rPr>

</xml_diff>

<commit_message>
Deviation 9: remove pilot metric 5 (effort per case); decision rule now 3 of 4 threshold metrics; protocol v0.1, v0.3-v0.5, memo and one-pager edited in place with amendment note; methods and gates pages
</commit_message>
<xml_diff>
--- a/docs/outputs/01_Design/gsr_purpose_and_pilot_summary/20261009_Purpose-and-Use-Memo_final-draft.docx
+++ b/docs/outputs/01_Design/gsr_purpose_and_pilot_summary/20261009_Purpose-and-Use-Memo_final-draft.docx
@@ -3524,7 +3524,7 @@
                 <w:szCs w:val="17"/>
                 <w:rtl w:val="0"/>
               </w:rPr>
-              <w:t xml:space="preserve">5. Effort per case</w:t>
+              <w:t xml:space="preserve">5. Evidence grade and scaling</w:t>
             </w:r>
             <w:r>
               <w:rPr>
@@ -3554,36 +3554,36 @@
                 <w:szCs w:val="17"/>
                 <w:rtl w:val="0"/>
               </w:rPr>
-              <w:t xml:space="preserve">Whether the full exercise is affordable, based on an estimate of its total cost</w:t>
-            </w:r>
-            <w:r>
-              <w:rPr>
-                <w:rtl w:val="0"/>
-              </w:rPr>
-            </w:r>
-          </w:p>
-        </w:tc>
-        <w:tc>
-          <w:tcPr>
-            <w:tcBorders>
-              <w:top w:color="000000" w:space="0" w:sz="4" w:val="single"/>
-              <w:bottom w:color="000000" w:space="0" w:sz="4" w:val="single"/>
-            </w:tcBorders>
-          </w:tcPr>
-          <w:p>
-            <w:pPr>
-              <w:spacing w:line="360" w:lineRule="auto"/>
-              <w:rPr/>
-            </w:pPr>
-            <w:r>
-              <w:rPr>
-                <w:rFonts w:ascii="Source Sans 3" w:cs="Source Sans 3" w:eastAsia="Source Sans 3" w:hAnsi="Source Sans 3"/>
-                <w:color w:val="000000"/>
-                <w:sz w:val="17"/>
-                <w:szCs w:val="17"/>
-                <w:rtl w:val="0"/>
-              </w:rPr>
-              <w:t xml:space="preserve">Average of 2 hours or less per case</w:t>
+              <w:t xml:space="preserve">Whether cases with stronger evidence were more likely to scale</w:t>
+            </w:r>
+            <w:r>
+              <w:rPr>
+                <w:rtl w:val="0"/>
+              </w:rPr>
+            </w:r>
+          </w:p>
+        </w:tc>
+        <w:tc>
+          <w:tcPr>
+            <w:tcBorders>
+              <w:top w:color="000000" w:space="0" w:sz="4" w:val="single"/>
+              <w:bottom w:color="000000" w:space="0" w:sz="4" w:val="single"/>
+            </w:tcBorders>
+          </w:tcPr>
+          <w:p>
+            <w:pPr>
+              <w:spacing w:line="360" w:lineRule="auto"/>
+              <w:rPr/>
+            </w:pPr>
+            <w:r>
+              <w:rPr>
+                <w:rFonts w:ascii="Source Sans 3" w:cs="Source Sans 3" w:eastAsia="Source Sans 3" w:hAnsi="Source Sans 3"/>
+                <w:color w:val="000000"/>
+                <w:sz w:val="17"/>
+                <w:szCs w:val="17"/>
+                <w:rtl w:val="0"/>
+              </w:rPr>
+              <w:t xml:space="preserve">Reported as a first read, not pass or fail</w:t>
             </w:r>
             <w:r>
               <w:rPr>
@@ -3619,102 +3619,7 @@
                 <w:szCs w:val="17"/>
                 <w:rtl w:val="0"/>
               </w:rPr>
-              <w:t xml:space="preserve">6. Evidence grade and scaling</w:t>
-            </w:r>
-            <w:r>
-              <w:rPr>
-                <w:rtl w:val="0"/>
-              </w:rPr>
-            </w:r>
-          </w:p>
-        </w:tc>
-        <w:tc>
-          <w:tcPr>
-            <w:tcBorders>
-              <w:top w:color="000000" w:space="0" w:sz="4" w:val="single"/>
-              <w:bottom w:color="000000" w:space="0" w:sz="4" w:val="single"/>
-              <w:right w:color="000000" w:space="0" w:sz="4" w:val="single"/>
-            </w:tcBorders>
-          </w:tcPr>
-          <w:p>
-            <w:pPr>
-              <w:spacing w:line="360" w:lineRule="auto"/>
-              <w:rPr/>
-            </w:pPr>
-            <w:r>
-              <w:rPr>
-                <w:rFonts w:ascii="Source Sans 3" w:cs="Source Sans 3" w:eastAsia="Source Sans 3" w:hAnsi="Source Sans 3"/>
-                <w:color w:val="000000"/>
-                <w:sz w:val="17"/>
-                <w:szCs w:val="17"/>
-                <w:rtl w:val="0"/>
-              </w:rPr>
-              <w:t xml:space="preserve">Whether cases with stronger evidence were more likely to scale</w:t>
-            </w:r>
-            <w:r>
-              <w:rPr>
-                <w:rtl w:val="0"/>
-              </w:rPr>
-            </w:r>
-          </w:p>
-        </w:tc>
-        <w:tc>
-          <w:tcPr>
-            <w:tcBorders>
-              <w:top w:color="000000" w:space="0" w:sz="4" w:val="single"/>
-              <w:bottom w:color="000000" w:space="0" w:sz="4" w:val="single"/>
-            </w:tcBorders>
-          </w:tcPr>
-          <w:p>
-            <w:pPr>
-              <w:spacing w:line="360" w:lineRule="auto"/>
-              <w:rPr/>
-            </w:pPr>
-            <w:r>
-              <w:rPr>
-                <w:rFonts w:ascii="Source Sans 3" w:cs="Source Sans 3" w:eastAsia="Source Sans 3" w:hAnsi="Source Sans 3"/>
-                <w:color w:val="000000"/>
-                <w:sz w:val="17"/>
-                <w:szCs w:val="17"/>
-                <w:rtl w:val="0"/>
-              </w:rPr>
-              <w:t xml:space="preserve">Reported as a first read, not pass or fail</w:t>
-            </w:r>
-            <w:r>
-              <w:rPr>
-                <w:rtl w:val="0"/>
-              </w:rPr>
-            </w:r>
-          </w:p>
-        </w:tc>
-      </w:tr>
-      <w:tr>
-        <w:trPr>
-          <w:cantSplit w:val="1"/>
-          <w:tblHeader w:val="0"/>
-        </w:trPr>
-        <w:tc>
-          <w:tcPr>
-            <w:tcBorders>
-              <w:top w:color="000000" w:space="0" w:sz="4" w:val="single"/>
-              <w:bottom w:color="000000" w:space="0" w:sz="4" w:val="single"/>
-              <w:right w:color="000000" w:space="0" w:sz="4" w:val="single"/>
-            </w:tcBorders>
-          </w:tcPr>
-          <w:p>
-            <w:pPr>
-              <w:spacing w:line="360" w:lineRule="auto"/>
-              <w:rPr/>
-            </w:pPr>
-            <w:r>
-              <w:rPr>
-                <w:rFonts w:ascii="Source Sans 3" w:cs="Source Sans 3" w:eastAsia="Source Sans 3" w:hAnsi="Source Sans 3"/>
-                <w:color w:val="000000"/>
-                <w:sz w:val="17"/>
-                <w:szCs w:val="17"/>
-                <w:rtl w:val="0"/>
-              </w:rPr>
-              <w:t xml:space="preserve">7. Claims that held up</w:t>
+              <w:t xml:space="preserve">6. Claims that held up</w:t>
             </w:r>
             <w:r>
               <w:rPr>
@@ -3815,7 +3720,7 @@
           <w:color w:val="000000"/>
           <w:rtl w:val="0"/>
         </w:rPr>
-        <w:t xml:space="preserve"> We propose that the full Evidence Map should proceed if at least four of the five threshold metrics (1 to 5) are met and the method fixes identified in Week 3 can be made without redesigning the taxonomy or evidence scale. Metrics 6 and 7 show how much value a full exercise would add. GSR has final authority to approve or decline scaling up, based on its own criteria.</w:t>
+        <w:t xml:space="preserve"> We propose that the full Evidence Map should proceed if at least three of the four threshold metrics (1 to 4) are met and the method fixes identified in Week 3 can be made without redesigning the taxonomy or evidence scale. Metrics 5 and 6 show how much value a full exercise would add. GSR has final authority to approve or decline scaling up, based on its own criteria. (Amended 19 October 2026 with GSR's approval: the effort-per-case metric was removed.)</w:t>
       </w:r>
       <w:r>
         <w:rPr>

</xml_diff>